<commit_message>
docs: Word raporu ve BillingServiceTest (Emre Ercin) güncellendi
</commit_message>
<xml_diff>
--- a/Sifa_Poliklinigi_Proje_Raporu.docx
+++ b/Sifa_Poliklinigi_Proje_Raporu.docx
@@ -326,7 +326,7 @@
     </w:p>
     <w:p>
       <w:r>
-        <w:t>Proje geliştirme ve canlıya alma süreçlerinde karşılaşılabilecek riskler aşağıda tablolaştırılmıştır:</w:t>
+        <w:t>Proje geliştirme ve canlıya alma süreçlerinde karşılaşılabilecek riskler aşağıda tablo olarak sunulmuştur:</w:t>
       </w:r>
     </w:p>
     <w:tbl>
@@ -964,7 +964,7 @@
           <w:color w:val="006699"/>
           <w:sz w:val="26"/>
         </w:rPr>
-        <w:t>A. Proje Takvimi Akış Şeması (Mermaid)</w:t>
+        <w:t>A. Proje Takvimi Akış Şeması Kodu (Mermaid)</w:t>
       </w:r>
     </w:p>
     <w:p>
@@ -976,7 +976,7 @@
         <w:rPr>
           <w:rFonts w:ascii="Courier New" w:hAnsi="Courier New"/>
           <w:color w:val="003333"/>
-          <w:sz w:val="19"/>
+          <w:sz w:val="18"/>
         </w:rPr>
         <w:t>graph LR</w:t>
         <w:br/>
@@ -1015,7 +1015,7 @@
         <w:rPr>
           <w:rFonts w:ascii="Courier New" w:hAnsi="Courier New"/>
           <w:color w:val="003333"/>
-          <w:sz w:val="19"/>
+          <w:sz w:val="18"/>
         </w:rPr>
         <w:t>gantt</w:t>
         <w:br/>
@@ -1046,6 +1046,505 @@
         <w:t xml:space="preserve">    section Teslim</w:t>
         <w:br/>
         <w:t xml:space="preserve">    Rapor &amp; Sunum :e1, 2026-05-15, 8d</w:t>
+      </w:r>
+    </w:p>
+    <w:p>
+      <w:pPr>
+        <w:pStyle w:val="Heading2"/>
+        <w:spacing w:before="280" w:after="80"/>
+      </w:pPr>
+      <w:r>
+        <w:rPr>
+          <w:rFonts w:ascii="Arial" w:hAnsi="Arial"/>
+          <w:b/>
+          <w:color w:val="006699"/>
+          <w:sz w:val="26"/>
+        </w:rPr>
+        <w:t>C. Proje İş Paketi Takvimi</w:t>
+      </w:r>
+    </w:p>
+    <w:tbl>
+      <w:tblPr>
+        <w:tblStyle w:val="LightShading-Accent1"/>
+        <w:tblW w:type="auto" w:w="0"/>
+        <w:tblLook w:firstColumn="1" w:firstRow="1" w:lastColumn="0" w:lastRow="0" w:noHBand="0" w:noVBand="1" w:val="04A0"/>
+      </w:tblPr>
+      <w:tblGrid>
+        <w:gridCol w:w="1560"/>
+        <w:gridCol w:w="1560"/>
+        <w:gridCol w:w="1560"/>
+        <w:gridCol w:w="1560"/>
+        <w:gridCol w:w="1560"/>
+        <w:gridCol w:w="1560"/>
+      </w:tblGrid>
+      <w:tr>
+        <w:tc>
+          <w:tcPr>
+            <w:tcW w:type="dxa" w:w="1560"/>
+            <w:shd w:fill="003366"/>
+          </w:tcPr>
+          <w:p>
+            <w:r>
+              <w:rPr>
+                <w:b/>
+                <w:color w:val="FFFFFF"/>
+              </w:rPr>
+              <w:t>İş Paketi</w:t>
+            </w:r>
+          </w:p>
+        </w:tc>
+        <w:tc>
+          <w:tcPr>
+            <w:tcW w:type="dxa" w:w="1560"/>
+            <w:shd w:fill="003366"/>
+          </w:tcPr>
+          <w:p>
+            <w:r>
+              <w:rPr>
+                <w:b/>
+                <w:color w:val="FFFFFF"/>
+              </w:rPr>
+              <w:t>Başlangıç</w:t>
+            </w:r>
+          </w:p>
+        </w:tc>
+        <w:tc>
+          <w:tcPr>
+            <w:tcW w:type="dxa" w:w="1560"/>
+            <w:shd w:fill="003366"/>
+          </w:tcPr>
+          <w:p>
+            <w:r>
+              <w:rPr>
+                <w:b/>
+                <w:color w:val="FFFFFF"/>
+              </w:rPr>
+              <w:t>Bitiş</w:t>
+            </w:r>
+          </w:p>
+        </w:tc>
+        <w:tc>
+          <w:tcPr>
+            <w:tcW w:type="dxa" w:w="1560"/>
+            <w:shd w:fill="003366"/>
+          </w:tcPr>
+          <w:p>
+            <w:r>
+              <w:rPr>
+                <w:b/>
+                <w:color w:val="FFFFFF"/>
+              </w:rPr>
+              <w:t>Süre</w:t>
+            </w:r>
+          </w:p>
+        </w:tc>
+        <w:tc>
+          <w:tcPr>
+            <w:tcW w:type="dxa" w:w="1560"/>
+            <w:shd w:fill="003366"/>
+          </w:tcPr>
+          <w:p>
+            <w:r>
+              <w:rPr>
+                <w:b/>
+                <w:color w:val="FFFFFF"/>
+              </w:rPr>
+              <w:t>Sorumlular</w:t>
+            </w:r>
+          </w:p>
+        </w:tc>
+        <w:tc>
+          <w:tcPr>
+            <w:tcW w:type="dxa" w:w="1560"/>
+            <w:shd w:fill="003366"/>
+          </w:tcPr>
+          <w:p>
+            <w:r>
+              <w:rPr>
+                <w:b/>
+                <w:color w:val="FFFFFF"/>
+              </w:rPr>
+              <w:t>Açıklama</w:t>
+            </w:r>
+          </w:p>
+        </w:tc>
+      </w:tr>
+      <w:tr>
+        <w:tc>
+          <w:tcPr>
+            <w:tcW w:type="dxa" w:w="1560"/>
+          </w:tcPr>
+          <w:p>
+            <w:r>
+              <w:t>Analiz &amp; Gereksinim Belirleme</w:t>
+            </w:r>
+          </w:p>
+        </w:tc>
+        <w:tc>
+          <w:tcPr>
+            <w:tcW w:type="dxa" w:w="1560"/>
+          </w:tcPr>
+          <w:p>
+            <w:r>
+              <w:t>01.03.2026</w:t>
+            </w:r>
+          </w:p>
+        </w:tc>
+        <w:tc>
+          <w:tcPr>
+            <w:tcW w:type="dxa" w:w="1560"/>
+          </w:tcPr>
+          <w:p>
+            <w:r>
+              <w:t>15.03.2026</w:t>
+            </w:r>
+          </w:p>
+        </w:tc>
+        <w:tc>
+          <w:tcPr>
+            <w:tcW w:type="dxa" w:w="1560"/>
+          </w:tcPr>
+          <w:p>
+            <w:r>
+              <w:t>14 Gün</w:t>
+            </w:r>
+          </w:p>
+        </w:tc>
+        <w:tc>
+          <w:tcPr>
+            <w:tcW w:type="dxa" w:w="1560"/>
+          </w:tcPr>
+          <w:p>
+            <w:r>
+              <w:t>Tüm Ekip</w:t>
+            </w:r>
+          </w:p>
+        </w:tc>
+        <w:tc>
+          <w:tcPr>
+            <w:tcW w:type="dxa" w:w="1560"/>
+          </w:tcPr>
+          <w:p>
+            <w:r>
+              <w:t>Kapsam analizi ve kısıtların yazılması</w:t>
+            </w:r>
+          </w:p>
+        </w:tc>
+      </w:tr>
+      <w:tr>
+        <w:tc>
+          <w:tcPr>
+            <w:tcW w:type="dxa" w:w="1560"/>
+          </w:tcPr>
+          <w:p>
+            <w:r>
+              <w:t>Veritabanı Şeması Tasarımı</w:t>
+            </w:r>
+          </w:p>
+        </w:tc>
+        <w:tc>
+          <w:tcPr>
+            <w:tcW w:type="dxa" w:w="1560"/>
+          </w:tcPr>
+          <w:p>
+            <w:r>
+              <w:t>16.03.2026</w:t>
+            </w:r>
+          </w:p>
+        </w:tc>
+        <w:tc>
+          <w:tcPr>
+            <w:tcW w:type="dxa" w:w="1560"/>
+          </w:tcPr>
+          <w:p>
+            <w:r>
+              <w:t>22.03.2026</w:t>
+            </w:r>
+          </w:p>
+        </w:tc>
+        <w:tc>
+          <w:tcPr>
+            <w:tcW w:type="dxa" w:w="1560"/>
+          </w:tcPr>
+          <w:p>
+            <w:r>
+              <w:t>7 Gün</w:t>
+            </w:r>
+          </w:p>
+        </w:tc>
+        <w:tc>
+          <w:tcPr>
+            <w:tcW w:type="dxa" w:w="1560"/>
+          </w:tcPr>
+          <w:p>
+            <w:r>
+              <w:t>Ömerhan, İsa</w:t>
+            </w:r>
+          </w:p>
+        </w:tc>
+        <w:tc>
+          <w:tcPr>
+            <w:tcW w:type="dxa" w:w="1560"/>
+          </w:tcPr>
+          <w:p>
+            <w:r>
+              <w:t>PostgreSQL şeması, Flyway migration planı</w:t>
+            </w:r>
+          </w:p>
+        </w:tc>
+      </w:tr>
+      <w:tr>
+        <w:tc>
+          <w:tcPr>
+            <w:tcW w:type="dxa" w:w="1560"/>
+          </w:tcPr>
+          <w:p>
+            <w:r>
+              <w:t>Backend &amp; API Geliştirme</w:t>
+            </w:r>
+          </w:p>
+        </w:tc>
+        <w:tc>
+          <w:tcPr>
+            <w:tcW w:type="dxa" w:w="1560"/>
+          </w:tcPr>
+          <w:p>
+            <w:r>
+              <w:t>23.03.2026</w:t>
+            </w:r>
+          </w:p>
+        </w:tc>
+        <w:tc>
+          <w:tcPr>
+            <w:tcW w:type="dxa" w:w="1560"/>
+          </w:tcPr>
+          <w:p>
+            <w:r>
+              <w:t>10.04.2026</w:t>
+            </w:r>
+          </w:p>
+        </w:tc>
+        <w:tc>
+          <w:tcPr>
+            <w:tcW w:type="dxa" w:w="1560"/>
+          </w:tcPr>
+          <w:p>
+            <w:r>
+              <w:t>19 Gün</w:t>
+            </w:r>
+          </w:p>
+        </w:tc>
+        <w:tc>
+          <w:tcPr>
+            <w:tcW w:type="dxa" w:w="1560"/>
+          </w:tcPr>
+          <w:p>
+            <w:r>
+              <w:t>İsa, Ömerhan</w:t>
+            </w:r>
+          </w:p>
+        </w:tc>
+        <w:tc>
+          <w:tcPr>
+            <w:tcW w:type="dxa" w:w="1560"/>
+          </w:tcPr>
+          <w:p>
+            <w:r>
+              <w:t>Spring Boot servisleri ve denetleyicilerin yazımı</w:t>
+            </w:r>
+          </w:p>
+        </w:tc>
+      </w:tr>
+      <w:tr>
+        <w:tc>
+          <w:tcPr>
+            <w:tcW w:type="dxa" w:w="1560"/>
+          </w:tcPr>
+          <w:p>
+            <w:r>
+              <w:t>Frontend Geliştirme</w:t>
+            </w:r>
+          </w:p>
+        </w:tc>
+        <w:tc>
+          <w:tcPr>
+            <w:tcW w:type="dxa" w:w="1560"/>
+          </w:tcPr>
+          <w:p>
+            <w:r>
+              <w:t>11.04.2026</w:t>
+            </w:r>
+          </w:p>
+        </w:tc>
+        <w:tc>
+          <w:tcPr>
+            <w:tcW w:type="dxa" w:w="1560"/>
+          </w:tcPr>
+          <w:p>
+            <w:r>
+              <w:t>28.04.2026</w:t>
+            </w:r>
+          </w:p>
+        </w:tc>
+        <w:tc>
+          <w:tcPr>
+            <w:tcW w:type="dxa" w:w="1560"/>
+          </w:tcPr>
+          <w:p>
+            <w:r>
+              <w:t>18 Gün</w:t>
+            </w:r>
+          </w:p>
+        </w:tc>
+        <w:tc>
+          <w:tcPr>
+            <w:tcW w:type="dxa" w:w="1560"/>
+          </w:tcPr>
+          <w:p>
+            <w:r>
+              <w:t>Emre, Yılmaz</w:t>
+            </w:r>
+          </w:p>
+        </w:tc>
+        <w:tc>
+          <w:tcPr>
+            <w:tcW w:type="dxa" w:w="1560"/>
+          </w:tcPr>
+          <w:p>
+            <w:r>
+              <w:t>React sayfaları ve MHRS Grid entegrasyonu</w:t>
+            </w:r>
+          </w:p>
+        </w:tc>
+      </w:tr>
+      <w:tr>
+        <w:tc>
+          <w:tcPr>
+            <w:tcW w:type="dxa" w:w="1560"/>
+          </w:tcPr>
+          <w:p>
+            <w:r>
+              <w:t>Birim Testleri &amp; Sınama</w:t>
+            </w:r>
+          </w:p>
+        </w:tc>
+        <w:tc>
+          <w:tcPr>
+            <w:tcW w:type="dxa" w:w="1560"/>
+          </w:tcPr>
+          <w:p>
+            <w:r>
+              <w:t>29.04.2026</w:t>
+            </w:r>
+          </w:p>
+        </w:tc>
+        <w:tc>
+          <w:tcPr>
+            <w:tcW w:type="dxa" w:w="1560"/>
+          </w:tcPr>
+          <w:p>
+            <w:r>
+              <w:t>10.05.2026</w:t>
+            </w:r>
+          </w:p>
+        </w:tc>
+        <w:tc>
+          <w:tcPr>
+            <w:tcW w:type="dxa" w:w="1560"/>
+          </w:tcPr>
+          <w:p>
+            <w:r>
+              <w:t>12 Gün</w:t>
+            </w:r>
+          </w:p>
+        </w:tc>
+        <w:tc>
+          <w:tcPr>
+            <w:tcW w:type="dxa" w:w="1560"/>
+          </w:tcPr>
+          <w:p>
+            <w:r>
+              <w:t>Yılmaz, İsa, Ömerhan, Emre</w:t>
+            </w:r>
+          </w:p>
+        </w:tc>
+        <w:tc>
+          <w:tcPr>
+            <w:tcW w:type="dxa" w:w="1560"/>
+          </w:tcPr>
+          <w:p>
+            <w:r>
+              <w:t>JUnit birim test senaryolarının kodlanıp koşulması</w:t>
+            </w:r>
+          </w:p>
+        </w:tc>
+      </w:tr>
+      <w:tr>
+        <w:tc>
+          <w:tcPr>
+            <w:tcW w:type="dxa" w:w="1560"/>
+          </w:tcPr>
+          <w:p>
+            <w:r>
+              <w:t>Raporlama &amp; Proje Teslimi</w:t>
+            </w:r>
+          </w:p>
+        </w:tc>
+        <w:tc>
+          <w:tcPr>
+            <w:tcW w:type="dxa" w:w="1560"/>
+          </w:tcPr>
+          <w:p>
+            <w:r>
+              <w:t>11.05.2026</w:t>
+            </w:r>
+          </w:p>
+        </w:tc>
+        <w:tc>
+          <w:tcPr>
+            <w:tcW w:type="dxa" w:w="1560"/>
+          </w:tcPr>
+          <w:p>
+            <w:r>
+              <w:t>22.05.2026</w:t>
+            </w:r>
+          </w:p>
+        </w:tc>
+        <w:tc>
+          <w:tcPr>
+            <w:tcW w:type="dxa" w:w="1560"/>
+          </w:tcPr>
+          <w:p>
+            <w:r>
+              <w:t>12 Gün</w:t>
+            </w:r>
+          </w:p>
+        </w:tc>
+        <w:tc>
+          <w:tcPr>
+            <w:tcW w:type="dxa" w:w="1560"/>
+          </w:tcPr>
+          <w:p>
+            <w:r>
+              <w:t>Tüm Ekip</w:t>
+            </w:r>
+          </w:p>
+        </w:tc>
+        <w:tc>
+          <w:tcPr>
+            <w:tcW w:type="dxa" w:w="1560"/>
+          </w:tcPr>
+          <w:p>
+            <w:r>
+              <w:t>Proje raporu, UML diyagram çizimleri ve teslim paketi</w:t>
+            </w:r>
+          </w:p>
+        </w:tc>
+      </w:tr>
+    </w:tbl>
+    <w:p>
+      <w:r>
+        <w:br w:type="page"/>
       </w:r>
     </w:p>
     <w:p>
@@ -1087,7 +1586,7 @@
         <w:rPr>
           <w:rFonts w:ascii="Courier New" w:hAnsi="Courier New"/>
           <w:color w:val="003333"/>
-          <w:sz w:val="19"/>
+          <w:sz w:val="18"/>
         </w:rPr>
         <w:t>graph LR</w:t>
         <w:br/>
@@ -1217,7 +1716,7 @@
     </w:p>
     <w:p>
       <w:r>
-        <w:t>Aşağıdaki matris yazılım gereksinimleri (G1-G9) ile bunları gerçekleyen sınıflar (B1-B10) arasındaki ilişkiyi gösterir:</w:t>
+        <w:t>Aşağıdaki matris yazılım gereksinimleri (G1-G9) ile bunları gerçekleyen kod sınıfları (B1-B10) arasındaki ilişkiyi gösterir:</w:t>
       </w:r>
     </w:p>
     <w:tbl>
@@ -1227,22 +1726,23 @@
         <w:tblLook w:firstColumn="1" w:firstRow="1" w:lastColumn="0" w:lastRow="0" w:noHBand="0" w:noVBand="1" w:val="04A0"/>
       </w:tblPr>
       <w:tblGrid>
-        <w:gridCol w:w="851"/>
-        <w:gridCol w:w="851"/>
-        <w:gridCol w:w="851"/>
-        <w:gridCol w:w="851"/>
-        <w:gridCol w:w="851"/>
-        <w:gridCol w:w="851"/>
-        <w:gridCol w:w="851"/>
-        <w:gridCol w:w="851"/>
-        <w:gridCol w:w="851"/>
-        <w:gridCol w:w="851"/>
-        <w:gridCol w:w="851"/>
+        <w:gridCol w:w="780"/>
+        <w:gridCol w:w="780"/>
+        <w:gridCol w:w="780"/>
+        <w:gridCol w:w="780"/>
+        <w:gridCol w:w="780"/>
+        <w:gridCol w:w="780"/>
+        <w:gridCol w:w="780"/>
+        <w:gridCol w:w="780"/>
+        <w:gridCol w:w="780"/>
+        <w:gridCol w:w="780"/>
+        <w:gridCol w:w="780"/>
+        <w:gridCol w:w="780"/>
       </w:tblGrid>
       <w:tr>
         <w:tc>
           <w:tcPr>
-            <w:tcW w:type="dxa" w:w="851"/>
+            <w:tcW w:type="dxa" w:w="780"/>
             <w:shd w:fill="003366"/>
           </w:tcPr>
           <w:p>
@@ -1251,13 +1751,13 @@
                 <w:b/>
                 <w:color w:val="FFFFFF"/>
               </w:rPr>
-              <w:t>Req</w:t>
+              <w:t>Req No</w:t>
             </w:r>
           </w:p>
         </w:tc>
         <w:tc>
           <w:tcPr>
-            <w:tcW w:type="dxa" w:w="851"/>
+            <w:tcW w:type="dxa" w:w="780"/>
             <w:shd w:fill="003366"/>
           </w:tcPr>
           <w:p>
@@ -1266,13 +1766,13 @@
                 <w:b/>
                 <w:color w:val="FFFFFF"/>
               </w:rPr>
-              <w:t>G1</w:t>
+              <w:t>Gereksinim Açıklaması</w:t>
             </w:r>
           </w:p>
         </w:tc>
         <w:tc>
           <w:tcPr>
-            <w:tcW w:type="dxa" w:w="851"/>
+            <w:tcW w:type="dxa" w:w="780"/>
             <w:shd w:fill="003366"/>
           </w:tcPr>
           <w:p>
@@ -1281,13 +1781,13 @@
                 <w:b/>
                 <w:color w:val="FFFFFF"/>
               </w:rPr>
-              <w:t>G2</w:t>
+              <w:t>B1</w:t>
             </w:r>
           </w:p>
         </w:tc>
         <w:tc>
           <w:tcPr>
-            <w:tcW w:type="dxa" w:w="851"/>
+            <w:tcW w:type="dxa" w:w="780"/>
             <w:shd w:fill="003366"/>
           </w:tcPr>
           <w:p>
@@ -1296,13 +1796,13 @@
                 <w:b/>
                 <w:color w:val="FFFFFF"/>
               </w:rPr>
-              <w:t>G3</w:t>
+              <w:t>B2</w:t>
             </w:r>
           </w:p>
         </w:tc>
         <w:tc>
           <w:tcPr>
-            <w:tcW w:type="dxa" w:w="851"/>
+            <w:tcW w:type="dxa" w:w="780"/>
             <w:shd w:fill="003366"/>
           </w:tcPr>
           <w:p>
@@ -1311,13 +1811,13 @@
                 <w:b/>
                 <w:color w:val="FFFFFF"/>
               </w:rPr>
-              <w:t>G4</w:t>
+              <w:t>B3</w:t>
             </w:r>
           </w:p>
         </w:tc>
         <w:tc>
           <w:tcPr>
-            <w:tcW w:type="dxa" w:w="851"/>
+            <w:tcW w:type="dxa" w:w="780"/>
             <w:shd w:fill="003366"/>
           </w:tcPr>
           <w:p>
@@ -1326,13 +1826,13 @@
                 <w:b/>
                 <w:color w:val="FFFFFF"/>
               </w:rPr>
-              <w:t>G5</w:t>
+              <w:t>B4</w:t>
             </w:r>
           </w:p>
         </w:tc>
         <w:tc>
           <w:tcPr>
-            <w:tcW w:type="dxa" w:w="851"/>
+            <w:tcW w:type="dxa" w:w="780"/>
             <w:shd w:fill="003366"/>
           </w:tcPr>
           <w:p>
@@ -1341,13 +1841,13 @@
                 <w:b/>
                 <w:color w:val="FFFFFF"/>
               </w:rPr>
-              <w:t>G6</w:t>
+              <w:t>B5</w:t>
             </w:r>
           </w:p>
         </w:tc>
         <w:tc>
           <w:tcPr>
-            <w:tcW w:type="dxa" w:w="851"/>
+            <w:tcW w:type="dxa" w:w="780"/>
             <w:shd w:fill="003366"/>
           </w:tcPr>
           <w:p>
@@ -1356,13 +1856,13 @@
                 <w:b/>
                 <w:color w:val="FFFFFF"/>
               </w:rPr>
-              <w:t>G7</w:t>
+              <w:t>B6</w:t>
             </w:r>
           </w:p>
         </w:tc>
         <w:tc>
           <w:tcPr>
-            <w:tcW w:type="dxa" w:w="851"/>
+            <w:tcW w:type="dxa" w:w="780"/>
             <w:shd w:fill="003366"/>
           </w:tcPr>
           <w:p>
@@ -1371,13 +1871,13 @@
                 <w:b/>
                 <w:color w:val="FFFFFF"/>
               </w:rPr>
-              <w:t>G8</w:t>
+              <w:t>B7</w:t>
             </w:r>
           </w:p>
         </w:tc>
         <w:tc>
           <w:tcPr>
-            <w:tcW w:type="dxa" w:w="851"/>
+            <w:tcW w:type="dxa" w:w="780"/>
             <w:shd w:fill="003366"/>
           </w:tcPr>
           <w:p>
@@ -1386,13 +1886,13 @@
                 <w:b/>
                 <w:color w:val="FFFFFF"/>
               </w:rPr>
-              <w:t>G9</w:t>
+              <w:t>B8</w:t>
             </w:r>
           </w:p>
         </w:tc>
         <w:tc>
           <w:tcPr>
-            <w:tcW w:type="dxa" w:w="851"/>
+            <w:tcW w:type="dxa" w:w="780"/>
             <w:shd w:fill="003366"/>
           </w:tcPr>
           <w:p>
@@ -1401,7 +1901,22 @@
                 <w:b/>
                 <w:color w:val="FFFFFF"/>
               </w:rPr>
-              <w:t>G10</w:t>
+              <w:t>B9</w:t>
+            </w:r>
+          </w:p>
+        </w:tc>
+        <w:tc>
+          <w:tcPr>
+            <w:tcW w:type="dxa" w:w="780"/>
+            <w:shd w:fill="003366"/>
+          </w:tcPr>
+          <w:p>
+            <w:r>
+              <w:rPr>
+                <w:b/>
+                <w:color w:val="FFFFFF"/>
+              </w:rPr>
+              <w:t>B10</w:t>
             </w:r>
           </w:p>
         </w:tc>
@@ -1409,7 +1924,7 @@
       <w:tr>
         <w:tc>
           <w:tcPr>
-            <w:tcW w:type="dxa" w:w="851"/>
+            <w:tcW w:type="dxa" w:w="780"/>
           </w:tcPr>
           <w:p>
             <w:r>
@@ -1419,7 +1934,17 @@
         </w:tc>
         <w:tc>
           <w:tcPr>
-            <w:tcW w:type="dxa" w:w="851"/>
+            <w:tcW w:type="dxa" w:w="780"/>
+          </w:tcPr>
+          <w:p>
+            <w:r>
+              <w:t>Dinamik Klinikler (Klinik CRUD)</w:t>
+            </w:r>
+          </w:p>
+        </w:tc>
+        <w:tc>
+          <w:tcPr>
+            <w:tcW w:type="dxa" w:w="780"/>
           </w:tcPr>
           <w:p>
             <w:r>
@@ -1429,7 +1954,7 @@
         </w:tc>
         <w:tc>
           <w:tcPr>
-            <w:tcW w:type="dxa" w:w="851"/>
+            <w:tcW w:type="dxa" w:w="780"/>
           </w:tcPr>
           <w:p>
             <w:r>
@@ -1439,7 +1964,7 @@
         </w:tc>
         <w:tc>
           <w:tcPr>
-            <w:tcW w:type="dxa" w:w="851"/>
+            <w:tcW w:type="dxa" w:w="780"/>
           </w:tcPr>
           <w:p>
             <w:r>
@@ -1449,7 +1974,7 @@
         </w:tc>
         <w:tc>
           <w:tcPr>
-            <w:tcW w:type="dxa" w:w="851"/>
+            <w:tcW w:type="dxa" w:w="780"/>
           </w:tcPr>
           <w:p>
             <w:r>
@@ -1459,7 +1984,7 @@
         </w:tc>
         <w:tc>
           <w:tcPr>
-            <w:tcW w:type="dxa" w:w="851"/>
+            <w:tcW w:type="dxa" w:w="780"/>
           </w:tcPr>
           <w:p>
             <w:r>
@@ -1469,7 +1994,7 @@
         </w:tc>
         <w:tc>
           <w:tcPr>
-            <w:tcW w:type="dxa" w:w="851"/>
+            <w:tcW w:type="dxa" w:w="780"/>
           </w:tcPr>
           <w:p>
             <w:r>
@@ -1479,7 +2004,7 @@
         </w:tc>
         <w:tc>
           <w:tcPr>
-            <w:tcW w:type="dxa" w:w="851"/>
+            <w:tcW w:type="dxa" w:w="780"/>
           </w:tcPr>
           <w:p>
             <w:r>
@@ -1489,7 +2014,7 @@
         </w:tc>
         <w:tc>
           <w:tcPr>
-            <w:tcW w:type="dxa" w:w="851"/>
+            <w:tcW w:type="dxa" w:w="780"/>
           </w:tcPr>
           <w:p>
             <w:r>
@@ -1499,7 +2024,7 @@
         </w:tc>
         <w:tc>
           <w:tcPr>
-            <w:tcW w:type="dxa" w:w="851"/>
+            <w:tcW w:type="dxa" w:w="780"/>
           </w:tcPr>
           <w:p>
             <w:r>
@@ -1509,7 +2034,7 @@
         </w:tc>
         <w:tc>
           <w:tcPr>
-            <w:tcW w:type="dxa" w:w="851"/>
+            <w:tcW w:type="dxa" w:w="780"/>
           </w:tcPr>
           <w:p>
             <w:r>
@@ -1521,7 +2046,7 @@
       <w:tr>
         <w:tc>
           <w:tcPr>
-            <w:tcW w:type="dxa" w:w="851"/>
+            <w:tcW w:type="dxa" w:w="780"/>
           </w:tcPr>
           <w:p>
             <w:r>
@@ -1531,7 +2056,17 @@
         </w:tc>
         <w:tc>
           <w:tcPr>
-            <w:tcW w:type="dxa" w:w="851"/>
+            <w:tcW w:type="dxa" w:w="780"/>
+          </w:tcPr>
+          <w:p>
+            <w:r>
+              <w:t>Hekim-Klinik İlişkisi ve 30 Dk Slotları</w:t>
+            </w:r>
+          </w:p>
+        </w:tc>
+        <w:tc>
+          <w:tcPr>
+            <w:tcW w:type="dxa" w:w="780"/>
           </w:tcPr>
           <w:p>
             <w:r>
@@ -1541,7 +2076,7 @@
         </w:tc>
         <w:tc>
           <w:tcPr>
-            <w:tcW w:type="dxa" w:w="851"/>
+            <w:tcW w:type="dxa" w:w="780"/>
           </w:tcPr>
           <w:p>
             <w:r>
@@ -1551,7 +2086,7 @@
         </w:tc>
         <w:tc>
           <w:tcPr>
-            <w:tcW w:type="dxa" w:w="851"/>
+            <w:tcW w:type="dxa" w:w="780"/>
           </w:tcPr>
           <w:p>
             <w:r>
@@ -1561,7 +2096,7 @@
         </w:tc>
         <w:tc>
           <w:tcPr>
-            <w:tcW w:type="dxa" w:w="851"/>
+            <w:tcW w:type="dxa" w:w="780"/>
           </w:tcPr>
           <w:p>
             <w:r>
@@ -1571,7 +2106,7 @@
         </w:tc>
         <w:tc>
           <w:tcPr>
-            <w:tcW w:type="dxa" w:w="851"/>
+            <w:tcW w:type="dxa" w:w="780"/>
           </w:tcPr>
           <w:p>
             <w:r>
@@ -1581,7 +2116,7 @@
         </w:tc>
         <w:tc>
           <w:tcPr>
-            <w:tcW w:type="dxa" w:w="851"/>
+            <w:tcW w:type="dxa" w:w="780"/>
           </w:tcPr>
           <w:p>
             <w:r>
@@ -1591,7 +2126,7 @@
         </w:tc>
         <w:tc>
           <w:tcPr>
-            <w:tcW w:type="dxa" w:w="851"/>
+            <w:tcW w:type="dxa" w:w="780"/>
           </w:tcPr>
           <w:p>
             <w:r>
@@ -1601,7 +2136,7 @@
         </w:tc>
         <w:tc>
           <w:tcPr>
-            <w:tcW w:type="dxa" w:w="851"/>
+            <w:tcW w:type="dxa" w:w="780"/>
           </w:tcPr>
           <w:p>
             <w:r>
@@ -1611,7 +2146,7 @@
         </w:tc>
         <w:tc>
           <w:tcPr>
-            <w:tcW w:type="dxa" w:w="851"/>
+            <w:tcW w:type="dxa" w:w="780"/>
           </w:tcPr>
           <w:p>
             <w:r>
@@ -1621,7 +2156,7 @@
         </w:tc>
         <w:tc>
           <w:tcPr>
-            <w:tcW w:type="dxa" w:w="851"/>
+            <w:tcW w:type="dxa" w:w="780"/>
           </w:tcPr>
           <w:p>
             <w:r>
@@ -1633,7 +2168,7 @@
       <w:tr>
         <w:tc>
           <w:tcPr>
-            <w:tcW w:type="dxa" w:w="851"/>
+            <w:tcW w:type="dxa" w:w="780"/>
           </w:tcPr>
           <w:p>
             <w:r>
@@ -1643,7 +2178,17 @@
         </w:tc>
         <w:tc>
           <w:tcPr>
-            <w:tcW w:type="dxa" w:w="851"/>
+            <w:tcW w:type="dxa" w:w="780"/>
+          </w:tcPr>
+          <w:p>
+            <w:r>
+              <w:t>Kayıt Görevlisi Hasta Kayıt ve Arama</w:t>
+            </w:r>
+          </w:p>
+        </w:tc>
+        <w:tc>
+          <w:tcPr>
+            <w:tcW w:type="dxa" w:w="780"/>
           </w:tcPr>
           <w:p>
             <w:r>
@@ -1653,7 +2198,7 @@
         </w:tc>
         <w:tc>
           <w:tcPr>
-            <w:tcW w:type="dxa" w:w="851"/>
+            <w:tcW w:type="dxa" w:w="780"/>
           </w:tcPr>
           <w:p>
             <w:r>
@@ -1663,7 +2208,7 @@
         </w:tc>
         <w:tc>
           <w:tcPr>
-            <w:tcW w:type="dxa" w:w="851"/>
+            <w:tcW w:type="dxa" w:w="780"/>
           </w:tcPr>
           <w:p>
             <w:r>
@@ -1673,7 +2218,7 @@
         </w:tc>
         <w:tc>
           <w:tcPr>
-            <w:tcW w:type="dxa" w:w="851"/>
+            <w:tcW w:type="dxa" w:w="780"/>
           </w:tcPr>
           <w:p>
             <w:r>
@@ -1683,7 +2228,7 @@
         </w:tc>
         <w:tc>
           <w:tcPr>
-            <w:tcW w:type="dxa" w:w="851"/>
+            <w:tcW w:type="dxa" w:w="780"/>
           </w:tcPr>
           <w:p>
             <w:r>
@@ -1693,7 +2238,7 @@
         </w:tc>
         <w:tc>
           <w:tcPr>
-            <w:tcW w:type="dxa" w:w="851"/>
+            <w:tcW w:type="dxa" w:w="780"/>
           </w:tcPr>
           <w:p>
             <w:r>
@@ -1703,7 +2248,7 @@
         </w:tc>
         <w:tc>
           <w:tcPr>
-            <w:tcW w:type="dxa" w:w="851"/>
+            <w:tcW w:type="dxa" w:w="780"/>
           </w:tcPr>
           <w:p>
             <w:r>
@@ -1713,7 +2258,7 @@
         </w:tc>
         <w:tc>
           <w:tcPr>
-            <w:tcW w:type="dxa" w:w="851"/>
+            <w:tcW w:type="dxa" w:w="780"/>
           </w:tcPr>
           <w:p>
             <w:r>
@@ -1723,7 +2268,7 @@
         </w:tc>
         <w:tc>
           <w:tcPr>
-            <w:tcW w:type="dxa" w:w="851"/>
+            <w:tcW w:type="dxa" w:w="780"/>
           </w:tcPr>
           <w:p>
             <w:r>
@@ -1733,7 +2278,7 @@
         </w:tc>
         <w:tc>
           <w:tcPr>
-            <w:tcW w:type="dxa" w:w="851"/>
+            <w:tcW w:type="dxa" w:w="780"/>
           </w:tcPr>
           <w:p>
             <w:r>
@@ -1745,7 +2290,7 @@
       <w:tr>
         <w:tc>
           <w:tcPr>
-            <w:tcW w:type="dxa" w:w="851"/>
+            <w:tcW w:type="dxa" w:w="780"/>
           </w:tcPr>
           <w:p>
             <w:r>
@@ -1755,7 +2300,17 @@
         </w:tc>
         <w:tc>
           <w:tcPr>
-            <w:tcW w:type="dxa" w:w="851"/>
+            <w:tcW w:type="dxa" w:w="780"/>
+          </w:tcPr>
+          <w:p>
+            <w:r>
+              <w:t>Randevu Alma ve Alternatif Tarih Önerisi</w:t>
+            </w:r>
+          </w:p>
+        </w:tc>
+        <w:tc>
+          <w:tcPr>
+            <w:tcW w:type="dxa" w:w="780"/>
           </w:tcPr>
           <w:p>
             <w:r>
@@ -1765,7 +2320,7 @@
         </w:tc>
         <w:tc>
           <w:tcPr>
-            <w:tcW w:type="dxa" w:w="851"/>
+            <w:tcW w:type="dxa" w:w="780"/>
           </w:tcPr>
           <w:p>
             <w:r>
@@ -1775,7 +2330,7 @@
         </w:tc>
         <w:tc>
           <w:tcPr>
-            <w:tcW w:type="dxa" w:w="851"/>
+            <w:tcW w:type="dxa" w:w="780"/>
           </w:tcPr>
           <w:p>
             <w:r>
@@ -1785,7 +2340,7 @@
         </w:tc>
         <w:tc>
           <w:tcPr>
-            <w:tcW w:type="dxa" w:w="851"/>
+            <w:tcW w:type="dxa" w:w="780"/>
           </w:tcPr>
           <w:p>
             <w:r>
@@ -1795,7 +2350,7 @@
         </w:tc>
         <w:tc>
           <w:tcPr>
-            <w:tcW w:type="dxa" w:w="851"/>
+            <w:tcW w:type="dxa" w:w="780"/>
           </w:tcPr>
           <w:p>
             <w:r>
@@ -1805,7 +2360,7 @@
         </w:tc>
         <w:tc>
           <w:tcPr>
-            <w:tcW w:type="dxa" w:w="851"/>
+            <w:tcW w:type="dxa" w:w="780"/>
           </w:tcPr>
           <w:p>
             <w:r>
@@ -1815,7 +2370,7 @@
         </w:tc>
         <w:tc>
           <w:tcPr>
-            <w:tcW w:type="dxa" w:w="851"/>
+            <w:tcW w:type="dxa" w:w="780"/>
           </w:tcPr>
           <w:p>
             <w:r>
@@ -1825,7 +2380,7 @@
         </w:tc>
         <w:tc>
           <w:tcPr>
-            <w:tcW w:type="dxa" w:w="851"/>
+            <w:tcW w:type="dxa" w:w="780"/>
           </w:tcPr>
           <w:p>
             <w:r>
@@ -1835,7 +2390,7 @@
         </w:tc>
         <w:tc>
           <w:tcPr>
-            <w:tcW w:type="dxa" w:w="851"/>
+            <w:tcW w:type="dxa" w:w="780"/>
           </w:tcPr>
           <w:p>
             <w:r>
@@ -1845,7 +2400,7 @@
         </w:tc>
         <w:tc>
           <w:tcPr>
-            <w:tcW w:type="dxa" w:w="851"/>
+            <w:tcW w:type="dxa" w:w="780"/>
           </w:tcPr>
           <w:p>
             <w:r>
@@ -1857,7 +2412,7 @@
       <w:tr>
         <w:tc>
           <w:tcPr>
-            <w:tcW w:type="dxa" w:w="851"/>
+            <w:tcW w:type="dxa" w:w="780"/>
           </w:tcPr>
           <w:p>
             <w:r>
@@ -1867,7 +2422,17 @@
         </w:tc>
         <w:tc>
           <w:tcPr>
-            <w:tcW w:type="dxa" w:w="851"/>
+            <w:tcW w:type="dxa" w:w="780"/>
+          </w:tcPr>
+          <w:p>
+            <w:r>
+              <w:t>Kayıtsız Hastanın Kayda Aktarılması</w:t>
+            </w:r>
+          </w:p>
+        </w:tc>
+        <w:tc>
+          <w:tcPr>
+            <w:tcW w:type="dxa" w:w="780"/>
           </w:tcPr>
           <w:p>
             <w:r>
@@ -1877,7 +2442,7 @@
         </w:tc>
         <w:tc>
           <w:tcPr>
-            <w:tcW w:type="dxa" w:w="851"/>
+            <w:tcW w:type="dxa" w:w="780"/>
           </w:tcPr>
           <w:p>
             <w:r>
@@ -1887,7 +2452,7 @@
         </w:tc>
         <w:tc>
           <w:tcPr>
-            <w:tcW w:type="dxa" w:w="851"/>
+            <w:tcW w:type="dxa" w:w="780"/>
           </w:tcPr>
           <w:p>
             <w:r>
@@ -1897,7 +2462,7 @@
         </w:tc>
         <w:tc>
           <w:tcPr>
-            <w:tcW w:type="dxa" w:w="851"/>
+            <w:tcW w:type="dxa" w:w="780"/>
           </w:tcPr>
           <w:p>
             <w:r>
@@ -1907,7 +2472,7 @@
         </w:tc>
         <w:tc>
           <w:tcPr>
-            <w:tcW w:type="dxa" w:w="851"/>
+            <w:tcW w:type="dxa" w:w="780"/>
           </w:tcPr>
           <w:p>
             <w:r>
@@ -1917,7 +2482,7 @@
         </w:tc>
         <w:tc>
           <w:tcPr>
-            <w:tcW w:type="dxa" w:w="851"/>
+            <w:tcW w:type="dxa" w:w="780"/>
           </w:tcPr>
           <w:p>
             <w:r>
@@ -1927,7 +2492,7 @@
         </w:tc>
         <w:tc>
           <w:tcPr>
-            <w:tcW w:type="dxa" w:w="851"/>
+            <w:tcW w:type="dxa" w:w="780"/>
           </w:tcPr>
           <w:p>
             <w:r>
@@ -1937,7 +2502,7 @@
         </w:tc>
         <w:tc>
           <w:tcPr>
-            <w:tcW w:type="dxa" w:w="851"/>
+            <w:tcW w:type="dxa" w:w="780"/>
           </w:tcPr>
           <w:p>
             <w:r>
@@ -1947,7 +2512,7 @@
         </w:tc>
         <w:tc>
           <w:tcPr>
-            <w:tcW w:type="dxa" w:w="851"/>
+            <w:tcW w:type="dxa" w:w="780"/>
           </w:tcPr>
           <w:p>
             <w:r>
@@ -1957,7 +2522,7 @@
         </w:tc>
         <w:tc>
           <w:tcPr>
-            <w:tcW w:type="dxa" w:w="851"/>
+            <w:tcW w:type="dxa" w:w="780"/>
           </w:tcPr>
           <w:p>
             <w:r>
@@ -1969,7 +2534,7 @@
       <w:tr>
         <w:tc>
           <w:tcPr>
-            <w:tcW w:type="dxa" w:w="851"/>
+            <w:tcW w:type="dxa" w:w="780"/>
           </w:tcPr>
           <w:p>
             <w:r>
@@ -1979,7 +2544,17 @@
         </w:tc>
         <w:tc>
           <w:tcPr>
-            <w:tcW w:type="dxa" w:w="851"/>
+            <w:tcW w:type="dxa" w:w="780"/>
+          </w:tcPr>
+          <w:p>
+            <w:r>
+              <w:t>Doktor Muayene, Teşhis Girişi &amp; Belgeler</w:t>
+            </w:r>
+          </w:p>
+        </w:tc>
+        <w:tc>
+          <w:tcPr>
+            <w:tcW w:type="dxa" w:w="780"/>
           </w:tcPr>
           <w:p>
             <w:r>
@@ -1989,7 +2564,7 @@
         </w:tc>
         <w:tc>
           <w:tcPr>
-            <w:tcW w:type="dxa" w:w="851"/>
+            <w:tcW w:type="dxa" w:w="780"/>
           </w:tcPr>
           <w:p>
             <w:r>
@@ -1999,7 +2574,7 @@
         </w:tc>
         <w:tc>
           <w:tcPr>
-            <w:tcW w:type="dxa" w:w="851"/>
+            <w:tcW w:type="dxa" w:w="780"/>
           </w:tcPr>
           <w:p>
             <w:r>
@@ -2009,7 +2584,7 @@
         </w:tc>
         <w:tc>
           <w:tcPr>
-            <w:tcW w:type="dxa" w:w="851"/>
+            <w:tcW w:type="dxa" w:w="780"/>
           </w:tcPr>
           <w:p>
             <w:r>
@@ -2019,7 +2594,7 @@
         </w:tc>
         <w:tc>
           <w:tcPr>
-            <w:tcW w:type="dxa" w:w="851"/>
+            <w:tcW w:type="dxa" w:w="780"/>
           </w:tcPr>
           <w:p>
             <w:r>
@@ -2029,7 +2604,7 @@
         </w:tc>
         <w:tc>
           <w:tcPr>
-            <w:tcW w:type="dxa" w:w="851"/>
+            <w:tcW w:type="dxa" w:w="780"/>
           </w:tcPr>
           <w:p>
             <w:r>
@@ -2039,7 +2614,7 @@
         </w:tc>
         <w:tc>
           <w:tcPr>
-            <w:tcW w:type="dxa" w:w="851"/>
+            <w:tcW w:type="dxa" w:w="780"/>
           </w:tcPr>
           <w:p>
             <w:r>
@@ -2049,7 +2624,7 @@
         </w:tc>
         <w:tc>
           <w:tcPr>
-            <w:tcW w:type="dxa" w:w="851"/>
+            <w:tcW w:type="dxa" w:w="780"/>
           </w:tcPr>
           <w:p>
             <w:r>
@@ -2059,7 +2634,7 @@
         </w:tc>
         <w:tc>
           <w:tcPr>
-            <w:tcW w:type="dxa" w:w="851"/>
+            <w:tcW w:type="dxa" w:w="780"/>
           </w:tcPr>
           <w:p>
             <w:r>
@@ -2069,7 +2644,7 @@
         </w:tc>
         <w:tc>
           <w:tcPr>
-            <w:tcW w:type="dxa" w:w="851"/>
+            <w:tcW w:type="dxa" w:w="780"/>
           </w:tcPr>
           <w:p>
             <w:r>
@@ -2081,7 +2656,7 @@
       <w:tr>
         <w:tc>
           <w:tcPr>
-            <w:tcW w:type="dxa" w:w="851"/>
+            <w:tcW w:type="dxa" w:w="780"/>
           </w:tcPr>
           <w:p>
             <w:r>
@@ -2091,7 +2666,17 @@
         </w:tc>
         <w:tc>
           <w:tcPr>
-            <w:tcW w:type="dxa" w:w="851"/>
+            <w:tcW w:type="dxa" w:w="780"/>
+          </w:tcPr>
+          <w:p>
+            <w:r>
+              <w:t>Vezne Fatura Sorgulama ve Kalem Ekleme</w:t>
+            </w:r>
+          </w:p>
+        </w:tc>
+        <w:tc>
+          <w:tcPr>
+            <w:tcW w:type="dxa" w:w="780"/>
           </w:tcPr>
           <w:p>
             <w:r>
@@ -2101,7 +2686,7 @@
         </w:tc>
         <w:tc>
           <w:tcPr>
-            <w:tcW w:type="dxa" w:w="851"/>
+            <w:tcW w:type="dxa" w:w="780"/>
           </w:tcPr>
           <w:p>
             <w:r>
@@ -2111,7 +2696,7 @@
         </w:tc>
         <w:tc>
           <w:tcPr>
-            <w:tcW w:type="dxa" w:w="851"/>
+            <w:tcW w:type="dxa" w:w="780"/>
           </w:tcPr>
           <w:p>
             <w:r>
@@ -2121,7 +2706,7 @@
         </w:tc>
         <w:tc>
           <w:tcPr>
-            <w:tcW w:type="dxa" w:w="851"/>
+            <w:tcW w:type="dxa" w:w="780"/>
           </w:tcPr>
           <w:p>
             <w:r>
@@ -2131,7 +2716,7 @@
         </w:tc>
         <w:tc>
           <w:tcPr>
-            <w:tcW w:type="dxa" w:w="851"/>
+            <w:tcW w:type="dxa" w:w="780"/>
           </w:tcPr>
           <w:p>
             <w:r>
@@ -2141,7 +2726,7 @@
         </w:tc>
         <w:tc>
           <w:tcPr>
-            <w:tcW w:type="dxa" w:w="851"/>
+            <w:tcW w:type="dxa" w:w="780"/>
           </w:tcPr>
           <w:p>
             <w:r>
@@ -2151,7 +2736,7 @@
         </w:tc>
         <w:tc>
           <w:tcPr>
-            <w:tcW w:type="dxa" w:w="851"/>
+            <w:tcW w:type="dxa" w:w="780"/>
           </w:tcPr>
           <w:p>
             <w:r>
@@ -2161,7 +2746,7 @@
         </w:tc>
         <w:tc>
           <w:tcPr>
-            <w:tcW w:type="dxa" w:w="851"/>
+            <w:tcW w:type="dxa" w:w="780"/>
           </w:tcPr>
           <w:p>
             <w:r>
@@ -2171,7 +2756,7 @@
         </w:tc>
         <w:tc>
           <w:tcPr>
-            <w:tcW w:type="dxa" w:w="851"/>
+            <w:tcW w:type="dxa" w:w="780"/>
           </w:tcPr>
           <w:p>
             <w:r>
@@ -2181,7 +2766,7 @@
         </w:tc>
         <w:tc>
           <w:tcPr>
-            <w:tcW w:type="dxa" w:w="851"/>
+            <w:tcW w:type="dxa" w:w="780"/>
           </w:tcPr>
           <w:p>
             <w:r>
@@ -2193,7 +2778,7 @@
       <w:tr>
         <w:tc>
           <w:tcPr>
-            <w:tcW w:type="dxa" w:w="851"/>
+            <w:tcW w:type="dxa" w:w="780"/>
           </w:tcPr>
           <w:p>
             <w:r>
@@ -2203,7 +2788,17 @@
         </w:tc>
         <w:tc>
           <w:tcPr>
-            <w:tcW w:type="dxa" w:w="851"/>
+            <w:tcW w:type="dxa" w:w="780"/>
+          </w:tcPr>
+          <w:p>
+            <w:r>
+              <w:t>SGK Sigorta Sorgulama ve İndirim Uygulama</w:t>
+            </w:r>
+          </w:p>
+        </w:tc>
+        <w:tc>
+          <w:tcPr>
+            <w:tcW w:type="dxa" w:w="780"/>
           </w:tcPr>
           <w:p>
             <w:r>
@@ -2213,7 +2808,7 @@
         </w:tc>
         <w:tc>
           <w:tcPr>
-            <w:tcW w:type="dxa" w:w="851"/>
+            <w:tcW w:type="dxa" w:w="780"/>
           </w:tcPr>
           <w:p>
             <w:r>
@@ -2223,7 +2818,7 @@
         </w:tc>
         <w:tc>
           <w:tcPr>
-            <w:tcW w:type="dxa" w:w="851"/>
+            <w:tcW w:type="dxa" w:w="780"/>
           </w:tcPr>
           <w:p>
             <w:r>
@@ -2233,7 +2828,7 @@
         </w:tc>
         <w:tc>
           <w:tcPr>
-            <w:tcW w:type="dxa" w:w="851"/>
+            <w:tcW w:type="dxa" w:w="780"/>
           </w:tcPr>
           <w:p>
             <w:r>
@@ -2243,7 +2838,7 @@
         </w:tc>
         <w:tc>
           <w:tcPr>
-            <w:tcW w:type="dxa" w:w="851"/>
+            <w:tcW w:type="dxa" w:w="780"/>
           </w:tcPr>
           <w:p>
             <w:r>
@@ -2253,7 +2848,7 @@
         </w:tc>
         <w:tc>
           <w:tcPr>
-            <w:tcW w:type="dxa" w:w="851"/>
+            <w:tcW w:type="dxa" w:w="780"/>
           </w:tcPr>
           <w:p>
             <w:r>
@@ -2263,7 +2858,7 @@
         </w:tc>
         <w:tc>
           <w:tcPr>
-            <w:tcW w:type="dxa" w:w="851"/>
+            <w:tcW w:type="dxa" w:w="780"/>
           </w:tcPr>
           <w:p>
             <w:r>
@@ -2273,7 +2868,7 @@
         </w:tc>
         <w:tc>
           <w:tcPr>
-            <w:tcW w:type="dxa" w:w="851"/>
+            <w:tcW w:type="dxa" w:w="780"/>
           </w:tcPr>
           <w:p>
             <w:r>
@@ -2283,7 +2878,7 @@
         </w:tc>
         <w:tc>
           <w:tcPr>
-            <w:tcW w:type="dxa" w:w="851"/>
+            <w:tcW w:type="dxa" w:w="780"/>
           </w:tcPr>
           <w:p>
             <w:r>
@@ -2293,7 +2888,7 @@
         </w:tc>
         <w:tc>
           <w:tcPr>
-            <w:tcW w:type="dxa" w:w="851"/>
+            <w:tcW w:type="dxa" w:w="780"/>
           </w:tcPr>
           <w:p>
             <w:r>
@@ -2305,7 +2900,7 @@
       <w:tr>
         <w:tc>
           <w:tcPr>
-            <w:tcW w:type="dxa" w:w="851"/>
+            <w:tcW w:type="dxa" w:w="780"/>
           </w:tcPr>
           <w:p>
             <w:r>
@@ -2315,7 +2910,17 @@
         </w:tc>
         <w:tc>
           <w:tcPr>
-            <w:tcW w:type="dxa" w:w="851"/>
+            <w:tcW w:type="dxa" w:w="780"/>
+          </w:tcPr>
+          <w:p>
+            <w:r>
+              <w:t>Ödeme Yöntemi Sınırı (Nakit/Kart)</w:t>
+            </w:r>
+          </w:p>
+        </w:tc>
+        <w:tc>
+          <w:tcPr>
+            <w:tcW w:type="dxa" w:w="780"/>
           </w:tcPr>
           <w:p>
             <w:r>
@@ -2325,7 +2930,7 @@
         </w:tc>
         <w:tc>
           <w:tcPr>
-            <w:tcW w:type="dxa" w:w="851"/>
+            <w:tcW w:type="dxa" w:w="780"/>
           </w:tcPr>
           <w:p>
             <w:r>
@@ -2335,7 +2940,7 @@
         </w:tc>
         <w:tc>
           <w:tcPr>
-            <w:tcW w:type="dxa" w:w="851"/>
+            <w:tcW w:type="dxa" w:w="780"/>
           </w:tcPr>
           <w:p>
             <w:r>
@@ -2345,7 +2950,7 @@
         </w:tc>
         <w:tc>
           <w:tcPr>
-            <w:tcW w:type="dxa" w:w="851"/>
+            <w:tcW w:type="dxa" w:w="780"/>
           </w:tcPr>
           <w:p>
             <w:r>
@@ -2355,7 +2960,7 @@
         </w:tc>
         <w:tc>
           <w:tcPr>
-            <w:tcW w:type="dxa" w:w="851"/>
+            <w:tcW w:type="dxa" w:w="780"/>
           </w:tcPr>
           <w:p>
             <w:r>
@@ -2365,7 +2970,7 @@
         </w:tc>
         <w:tc>
           <w:tcPr>
-            <w:tcW w:type="dxa" w:w="851"/>
+            <w:tcW w:type="dxa" w:w="780"/>
           </w:tcPr>
           <w:p>
             <w:r>
@@ -2375,7 +2980,7 @@
         </w:tc>
         <w:tc>
           <w:tcPr>
-            <w:tcW w:type="dxa" w:w="851"/>
+            <w:tcW w:type="dxa" w:w="780"/>
           </w:tcPr>
           <w:p>
             <w:r>
@@ -2385,7 +2990,7 @@
         </w:tc>
         <w:tc>
           <w:tcPr>
-            <w:tcW w:type="dxa" w:w="851"/>
+            <w:tcW w:type="dxa" w:w="780"/>
           </w:tcPr>
           <w:p>
             <w:r>
@@ -2395,7 +3000,7 @@
         </w:tc>
         <w:tc>
           <w:tcPr>
-            <w:tcW w:type="dxa" w:w="851"/>
+            <w:tcW w:type="dxa" w:w="780"/>
           </w:tcPr>
           <w:p>
             <w:r>
@@ -2405,7 +3010,7 @@
         </w:tc>
         <w:tc>
           <w:tcPr>
-            <w:tcW w:type="dxa" w:w="851"/>
+            <w:tcW w:type="dxa" w:w="780"/>
           </w:tcPr>
           <w:p>
             <w:r>
@@ -2415,6 +3020,29 @@
         </w:tc>
       </w:tr>
     </w:tbl>
+    <w:p>
+      <w:r>
+        <w:rPr>
+          <w:b/>
+        </w:rPr>
+        <w:t>Kod Sınıfları Eşleşmesi (B1-B10):</w:t>
+        <w:br/>
+      </w:r>
+      <w:r>
+        <w:rPr>
+          <w:sz w:val="19"/>
+        </w:rPr>
+        <w:t>B1: AppUser / AppUserRepository,  B2: Clinic / ClinicRepository,  B3: Doctor / DoctorRepository</w:t>
+        <w:br/>
+        <w:t>B4: Patient / PatientRepository / PatientService,  B5: Appointment / AppointmentRepository / AppointmentService</w:t>
+        <w:br/>
+        <w:t>B6: AvailabilityService,  B7: VisitRecord / VisitRecordRepository / VisitService</w:t>
+        <w:br/>
+        <w:t>B8: BillingLine / BillingLineRepository / BillingService,  B9: Payment / PaymentRepository / PaymentService</w:t>
+        <w:br/>
+        <w:t>B10: InsuranceMockService</w:t>
+      </w:r>
+    </w:p>
     <w:p>
       <w:pPr>
         <w:pStyle w:val="Heading1"/>
@@ -2442,7 +3070,7 @@
           <w:color w:val="006699"/>
           <w:sz w:val="26"/>
         </w:rPr>
-        <w:t>Alan Sınıfı (Domain Class) Diyagramı Kodu</w:t>
+        <w:t>Alan Sınıfı (Domain Class) Diyagramı Kodu (Mermaid)</w:t>
       </w:r>
     </w:p>
     <w:p>
@@ -2454,7 +3082,7 @@
         <w:rPr>
           <w:rFonts w:ascii="Courier New" w:hAnsi="Courier New"/>
           <w:color w:val="003333"/>
-          <w:sz w:val="19"/>
+          <w:sz w:val="18"/>
         </w:rPr>
         <w:t>classDiagram</w:t>
         <w:br/>
@@ -2487,7 +3115,7 @@
           <w:color w:val="006699"/>
           <w:sz w:val="26"/>
         </w:rPr>
-        <w:t>Etkinlik (Activity) Diyagramı Kodu</w:t>
+        <w:t>Etkinlik (Activity) Diyagramı Kodu (Mermaid)</w:t>
       </w:r>
     </w:p>
     <w:p>
@@ -2499,7 +3127,7 @@
         <w:rPr>
           <w:rFonts w:ascii="Courier New" w:hAnsi="Courier New"/>
           <w:color w:val="003333"/>
-          <w:sz w:val="19"/>
+          <w:sz w:val="18"/>
         </w:rPr>
         <w:t>graph TD</w:t>
         <w:br/>
@@ -2540,7 +3168,7 @@
           <w:color w:val="006699"/>
           <w:sz w:val="26"/>
         </w:rPr>
-        <w:t>Durum (State) Diyagramı Kodu</w:t>
+        <w:t>Durum (State) Diyagramı Kodu (Mermaid)</w:t>
       </w:r>
     </w:p>
     <w:p>
@@ -2552,7 +3180,7 @@
         <w:rPr>
           <w:rFonts w:ascii="Courier New" w:hAnsi="Courier New"/>
           <w:color w:val="003333"/>
-          <w:sz w:val="19"/>
+          <w:sz w:val="18"/>
         </w:rPr>
         <w:t>stateDiagram-v2</w:t>
         <w:br/>
@@ -2626,7 +3254,7 @@
         <w:rPr>
           <w:rFonts w:ascii="Courier New" w:hAnsi="Courier New"/>
           <w:color w:val="003333"/>
-          <w:sz w:val="19"/>
+          <w:sz w:val="18"/>
         </w:rPr>
         <w:t>package com.sifa.poliklinik.service;</w:t>
         <w:br/>
@@ -2821,7 +3449,7 @@
         <w:rPr>
           <w:rFonts w:ascii="Courier New" w:hAnsi="Courier New"/>
           <w:color w:val="003333"/>
-          <w:sz w:val="19"/>
+          <w:sz w:val="18"/>
         </w:rPr>
         <w:t>package com.sifa.poliklinik.service;</w:t>
         <w:br/>
@@ -3111,7 +3739,7 @@
         <w:rPr>
           <w:rFonts w:ascii="Courier New" w:hAnsi="Courier New"/>
           <w:color w:val="003333"/>
-          <w:sz w:val="19"/>
+          <w:sz w:val="18"/>
         </w:rPr>
         <w:t>package com.sifa.poliklinik.service;</w:t>
         <w:br/>
@@ -3340,7 +3968,7 @@
           <w:color w:val="006699"/>
           <w:sz w:val="26"/>
         </w:rPr>
-        <w:t>D. Başarılı Test Çalıştırma Çıktısı (JUnit Terminal Logu)</w:t>
+        <w:t>D. BillingServiceTest (Tasarlayan: Emre Erçin - 22011095)</w:t>
       </w:r>
     </w:p>
     <w:p>
@@ -3352,7 +3980,282 @@
         <w:rPr>
           <w:rFonts w:ascii="Courier New" w:hAnsi="Courier New"/>
           <w:color w:val="003333"/>
-          <w:sz w:val="19"/>
+          <w:sz w:val="18"/>
+        </w:rPr>
+        <w:t>package com.sifa.poliklinik.service;</w:t>
+        <w:br/>
+        <w:br/>
+        <w:t>import static org.junit.jupiter.api.Assertions.*;</w:t>
+        <w:br/>
+        <w:t>import static org.mockito.ArgumentMatchers.any;</w:t>
+        <w:br/>
+        <w:t>import static org.mockito.Mockito.*;</w:t>
+        <w:br/>
+        <w:br/>
+        <w:t>import com.sifa.poliklinik.domain.BillingLine;</w:t>
+        <w:br/>
+        <w:t>import com.sifa.poliklinik.domain.ServiceCatalog;</w:t>
+        <w:br/>
+        <w:t>import com.sifa.poliklinik.domain.VisitRecord;</w:t>
+        <w:br/>
+        <w:t>import com.sifa.poliklinik.repository.AppointmentRepository;</w:t>
+        <w:br/>
+        <w:t>import com.sifa.poliklinik.repository.BillingLineRepository;</w:t>
+        <w:br/>
+        <w:t>import com.sifa.poliklinik.repository.PaymentRepository;</w:t>
+        <w:br/>
+        <w:t>import com.sifa.poliklinik.repository.ServiceCatalogRepository;</w:t>
+        <w:br/>
+        <w:t>import com.sifa.poliklinik.repository.VisitRecordRepository;</w:t>
+        <w:br/>
+        <w:t>import java.math.BigDecimal;</w:t>
+        <w:br/>
+        <w:t>import java.util.Optional;</w:t>
+        <w:br/>
+        <w:t>import org.junit.jupiter.api.DisplayName;</w:t>
+        <w:br/>
+        <w:t>import org.junit.jupiter.api.Test;</w:t>
+        <w:br/>
+        <w:t>import org.junit.jupiter.api.extension.ExtendWith;</w:t>
+        <w:br/>
+        <w:t>import org.mockito.InjectMocks;</w:t>
+        <w:br/>
+        <w:t>import org.mockito.Mock;</w:t>
+        <w:br/>
+        <w:t>import org.mockito.junit.jupiter.MockitoExtension;</w:t>
+        <w:br/>
+        <w:t>import org.mockito.junit.jupiter.MockitoSettings;</w:t>
+        <w:br/>
+        <w:t>import org.mockito.quality.Strictness;</w:t>
+        <w:br/>
+        <w:t>import org.springframework.web.server.ResponseStatusException;</w:t>
+        <w:br/>
+        <w:br/>
+        <w:t>/**</w:t>
+        <w:br/>
+        <w:t xml:space="preserve"> * BillingService birim testleri.</w:t>
+        <w:br/>
+        <w:t xml:space="preserve"> * Fatura kalemleri ekleme, silme ve ödeme durumu kontrollerini doğrular.</w:t>
+        <w:br/>
+        <w:t xml:space="preserve"> * </w:t>
+        <w:br/>
+        <w:t xml:space="preserve"> * @author Emre Erçin (Öğrenci No: 22011095) - UI/UX Sorumlusu &amp; Frontend Geliştirici</w:t>
+        <w:br/>
+        <w:t xml:space="preserve"> */</w:t>
+        <w:br/>
+        <w:t>@ExtendWith(MockitoExtension.class)</w:t>
+        <w:br/>
+        <w:t>@MockitoSettings(strictness = Strictness.LENIENT)</w:t>
+        <w:br/>
+        <w:t>class BillingServiceTest {</w:t>
+        <w:br/>
+        <w:br/>
+        <w:t xml:space="preserve">    @Mock private VisitRecordRepository visitRecordRepository;</w:t>
+        <w:br/>
+        <w:t xml:space="preserve">    @Mock private ServiceCatalogRepository serviceCatalogRepository;</w:t>
+        <w:br/>
+        <w:t xml:space="preserve">    @Mock private BillingLineRepository billingLineRepository;</w:t>
+        <w:br/>
+        <w:t xml:space="preserve">    @Mock private PaymentRepository paymentRepository;</w:t>
+        <w:br/>
+        <w:t xml:space="preserve">    @Mock private AppointmentRepository appointmentRepository;</w:t>
+        <w:br/>
+        <w:br/>
+        <w:t xml:space="preserve">    @InjectMocks</w:t>
+        <w:br/>
+        <w:t xml:space="preserve">    private BillingService billingService;</w:t>
+        <w:br/>
+        <w:br/>
+        <w:t xml:space="preserve">    @Test</w:t>
+        <w:br/>
+        <w:t xml:space="preserve">    @DisplayName("Faturaya yeni hizmet kalemi başarıyla eklenir")</w:t>
+        <w:br/>
+        <w:t xml:space="preserve">    void addLine_basarili() {</w:t>
+        <w:br/>
+        <w:t xml:space="preserve">        VisitRecord mockVisit = mock(VisitRecord.class);</w:t>
+        <w:br/>
+        <w:t xml:space="preserve">        when(mockVisit.getId()).thenReturn(1L);</w:t>
+        <w:br/>
+        <w:br/>
+        <w:t xml:space="preserve">        ServiceCatalog mockService = mock(ServiceCatalog.class);</w:t>
+        <w:br/>
+        <w:t xml:space="preserve">        when(mockService.getId()).thenReturn(2L);</w:t>
+        <w:br/>
+        <w:t xml:space="preserve">        when(mockService.getUnitPrice()).thenReturn(new BigDecimal("150.00"));</w:t>
+        <w:br/>
+        <w:br/>
+        <w:t xml:space="preserve">        when(visitRecordRepository.findFetchedById(1L)).thenReturn(Optional.of(mockVisit));</w:t>
+        <w:br/>
+        <w:t xml:space="preserve">        when(paymentRepository.existsByVisitId(1L)).thenReturn(false);</w:t>
+        <w:br/>
+        <w:t xml:space="preserve">        when(serviceCatalogRepository.findById(2L)).thenReturn(Optional.of(mockService));</w:t>
+        <w:br/>
+        <w:t xml:space="preserve">        </w:t>
+        <w:br/>
+        <w:t xml:space="preserve">        BillingLine mockLineSaved = mock(BillingLine.class);</w:t>
+        <w:br/>
+        <w:t xml:space="preserve">        when(mockLineSaved.getQuantity()).thenReturn(3);</w:t>
+        <w:br/>
+        <w:t xml:space="preserve">        when(mockLineSaved.getVisit()).thenReturn(mockVisit);</w:t>
+        <w:br/>
+        <w:t xml:space="preserve">        when(mockLineSaved.getServiceCatalog()).thenReturn(mockService);</w:t>
+        <w:br/>
+        <w:t xml:space="preserve">        when(mockLineSaved.getUnitPriceSnapshot()).thenReturn(new BigDecimal("150.00"));</w:t>
+        <w:br/>
+        <w:t xml:space="preserve">        </w:t>
+        <w:br/>
+        <w:t xml:space="preserve">        when(billingLineRepository.save(any(BillingLine.class))).thenReturn(mockLineSaved);</w:t>
+        <w:br/>
+        <w:br/>
+        <w:t xml:space="preserve">        BillingLine result = billingService.addLine(1L, 2L, 3);</w:t>
+        <w:br/>
+        <w:br/>
+        <w:t xml:space="preserve">        assertNotNull(result);</w:t>
+        <w:br/>
+        <w:t xml:space="preserve">        assertEquals(3, result.getQuantity());</w:t>
+        <w:br/>
+        <w:t xml:space="preserve">        assertEquals(mockVisit, result.getVisit());</w:t>
+        <w:br/>
+        <w:t xml:space="preserve">        assertEquals(mockService, result.getServiceCatalog());</w:t>
+        <w:br/>
+        <w:t xml:space="preserve">        assertEquals(new BigDecimal("150.00"), result.getUnitPriceSnapshot());</w:t>
+        <w:br/>
+        <w:t xml:space="preserve">        verify(billingLineRepository).save(any(BillingLine.class));</w:t>
+        <w:br/>
+        <w:t xml:space="preserve">    }</w:t>
+        <w:br/>
+        <w:br/>
+        <w:t xml:space="preserve">    @Test</w:t>
+        <w:br/>
+        <w:t xml:space="preserve">    @DisplayName("Fatura kalemi adedi 1'den küçük olamaz, hata fırlatılır")</w:t>
+        <w:br/>
+        <w:t xml:space="preserve">    void addLine_adetSifir_hataFirlatir() {</w:t>
+        <w:br/>
+        <w:t xml:space="preserve">        assertThrows(ResponseStatusException.class, () -&gt; billingService.addLine(1L, 2L, 0));</w:t>
+        <w:br/>
+        <w:t xml:space="preserve">    }</w:t>
+        <w:br/>
+        <w:br/>
+        <w:t xml:space="preserve">    @Test</w:t>
+        <w:br/>
+        <w:t xml:space="preserve">    @DisplayName("Ödemesi tamamlanmış bir ziyarete yeni kalem eklenemez, hata fırlatılır")</w:t>
+        <w:br/>
+        <w:t xml:space="preserve">    void addLine_odemeYapilmis_hataFirlatir() {</w:t>
+        <w:br/>
+        <w:t xml:space="preserve">        VisitRecord mockVisit = mock(VisitRecord.class);</w:t>
+        <w:br/>
+        <w:t xml:space="preserve">        when(mockVisit.getId()).thenReturn(1L);</w:t>
+        <w:br/>
+        <w:br/>
+        <w:t xml:space="preserve">        when(visitRecordRepository.findFetchedById(1L)).thenReturn(Optional.of(mockVisit));</w:t>
+        <w:br/>
+        <w:t xml:space="preserve">        when(paymentRepository.existsByVisitId(1L)).thenReturn(true);</w:t>
+        <w:br/>
+        <w:br/>
+        <w:t xml:space="preserve">        ResponseStatusException ex = assertThrows(ResponseStatusException.class, </w:t>
+        <w:br/>
+        <w:t xml:space="preserve">                () -&gt; billingService.addLine(1L, 2L, 2));</w:t>
+        <w:br/>
+        <w:t xml:space="preserve">        </w:t>
+        <w:br/>
+        <w:t xml:space="preserve">        assertTrue(ex.getReason().contains("Ödeme tamamlanmış"));</w:t>
+        <w:br/>
+        <w:t xml:space="preserve">    }</w:t>
+        <w:br/>
+        <w:br/>
+        <w:t xml:space="preserve">    @Test</w:t>
+        <w:br/>
+        <w:t xml:space="preserve">    @DisplayName("Fatura kalemi başarıyla silinir")</w:t>
+        <w:br/>
+        <w:t xml:space="preserve">    void deleteLine_basarili() {</w:t>
+        <w:br/>
+        <w:t xml:space="preserve">        VisitRecord mockVisit = mock(VisitRecord.class);</w:t>
+        <w:br/>
+        <w:t xml:space="preserve">        when(mockVisit.getId()).thenReturn(1L);</w:t>
+        <w:br/>
+        <w:br/>
+        <w:t xml:space="preserve">        BillingLine mockLine = mock(BillingLine.class);</w:t>
+        <w:br/>
+        <w:t xml:space="preserve">        when(mockLine.getId()).thenReturn(10L);</w:t>
+        <w:br/>
+        <w:t xml:space="preserve">        when(mockLine.getVisit()).thenReturn(mockVisit);</w:t>
+        <w:br/>
+        <w:br/>
+        <w:t xml:space="preserve">        when(billingLineRepository.findById(10L)).thenReturn(Optional.of(mockLine));</w:t>
+        <w:br/>
+        <w:t xml:space="preserve">        when(paymentRepository.existsByVisitId(1L)).thenReturn(false);</w:t>
+        <w:br/>
+        <w:br/>
+        <w:t xml:space="preserve">        assertDoesNotThrow(() -&gt; billingService.deleteLine(10L));</w:t>
+        <w:br/>
+        <w:t xml:space="preserve">        verify(billingLineRepository).delete(mockLine);</w:t>
+        <w:br/>
+        <w:t xml:space="preserve">    }</w:t>
+        <w:br/>
+        <w:br/>
+        <w:t xml:space="preserve">    @Test</w:t>
+        <w:br/>
+        <w:t xml:space="preserve">    @DisplayName("Ödemesi tamamlanmış faturadan kalem silinemez, hata fırlatılır")</w:t>
+        <w:br/>
+        <w:t xml:space="preserve">    void deleteLine_odemeYapilmis_hataFirlatir() {</w:t>
+        <w:br/>
+        <w:t xml:space="preserve">        VisitRecord mockVisit = mock(VisitRecord.class);</w:t>
+        <w:br/>
+        <w:t xml:space="preserve">        when(mockVisit.getId()).thenReturn(1L);</w:t>
+        <w:br/>
+        <w:br/>
+        <w:t xml:space="preserve">        BillingLine mockLine = mock(BillingLine.class);</w:t>
+        <w:br/>
+        <w:t xml:space="preserve">        when(mockLine.getId()).thenReturn(10L);</w:t>
+        <w:br/>
+        <w:t xml:space="preserve">        when(mockLine.getVisit()).thenReturn(mockVisit);</w:t>
+        <w:br/>
+        <w:br/>
+        <w:t xml:space="preserve">        when(billingLineRepository.findById(10L)).thenReturn(Optional.of(mockLine));</w:t>
+        <w:br/>
+        <w:t xml:space="preserve">        when(paymentRepository.existsByVisitId(1L)).thenReturn(true);</w:t>
+        <w:br/>
+        <w:br/>
+        <w:t xml:space="preserve">        ResponseStatusException ex = assertThrows(ResponseStatusException.class, </w:t>
+        <w:br/>
+        <w:t xml:space="preserve">                () -&gt; billingService.deleteLine(10L));</w:t>
+        <w:br/>
+        <w:br/>
+        <w:t xml:space="preserve">        assertTrue(ex.getReason().contains("Ödemesi tamamlanmış"));</w:t>
+        <w:br/>
+        <w:t xml:space="preserve">        verify(billingLineRepository, never()).delete(any());</w:t>
+        <w:br/>
+        <w:t xml:space="preserve">    }</w:t>
+        <w:br/>
+        <w:t>}</w:t>
+        <w:br/>
+      </w:r>
+    </w:p>
+    <w:p>
+      <w:pPr>
+        <w:pStyle w:val="Heading2"/>
+        <w:spacing w:before="280" w:after="80"/>
+      </w:pPr>
+      <w:r>
+        <w:rPr>
+          <w:rFonts w:ascii="Arial" w:hAnsi="Arial"/>
+          <w:b/>
+          <w:color w:val="006699"/>
+          <w:sz w:val="26"/>
+        </w:rPr>
+        <w:t>E. Başarılı Test Çalıştırma Çıktısı (JUnit Terminal Logu - 26 Test)</w:t>
+      </w:r>
+    </w:p>
+    <w:p>
+      <w:pPr>
+        <w:spacing w:before="120" w:after="120"/>
+        <w:ind w:left="360" w:right="360"/>
+      </w:pPr>
+      <w:r>
+        <w:rPr>
+          <w:rFonts w:ascii="Courier New" w:hAnsi="Courier New"/>
+          <w:color w:val="003333"/>
+          <w:sz w:val="18"/>
         </w:rPr>
         <w:t>[INFO] -------------------------------------------------------</w:t>
         <w:br/>
@@ -3360,23 +4263,27 @@
         <w:br/>
         <w:t>[INFO] -------------------------------------------------------</w:t>
         <w:br/>
+        <w:t>[INFO] Running com.sifa.poliklinik.service.PatientServiceTest</w:t>
+        <w:br/>
+        <w:t>[INFO] Tests run: 7, Failures: 0, Errors: 0, Skipped: 0, Time elapsed: 0.080 s -- in com.sifa.poliklinik.service.PatientServiceTest</w:t>
+        <w:br/>
         <w:t>[INFO] Running com.sifa.poliklinik.service.AdminUserServiceTest</w:t>
         <w:br/>
-        <w:t>[INFO] Tests run: 6, Failures: 0, Errors: 0, Skipped: 0, Time elapsed: 0.705 s -- in com.sifa.poliklinik.service.AdminUserServiceTest</w:t>
-        <w:br/>
-        <w:t>[INFO] Running com.sifa.poliklinik.service.PatientServiceTest</w:t>
-        <w:br/>
-        <w:t>[INFO] Tests run: 7, Failures: 0, Errors: 0, Skipped: 0, Time elapsed: 0.096 s -- in com.sifa.poliklinik.service.PatientServiceTest</w:t>
+        <w:t>[INFO] Tests run: 6, Failures: 0, Errors: 0, Skipped: 0, Time elapsed: 0.697 s -- in com.sifa.poliklinik.service.AdminUserServiceTest</w:t>
+        <w:br/>
+        <w:t>[INFO] Running com.sifa.poliklinik.service.BillingServiceTest</w:t>
+        <w:br/>
+        <w:t>[INFO] Tests run: 5, Failures: 0, Errors: 0, Skipped: 0, Time elapsed: 0.055 s -- in com.sifa.poliklinik.service.BillingServiceTest</w:t>
         <w:br/>
         <w:t>[INFO] Running com.sifa.poliklinik.service.InsuranceMockServiceTest</w:t>
         <w:br/>
-        <w:t>[INFO] Tests run: 8, Failures: 0, Errors: 0, Skipped: 0, Time elapsed: 0.014 s -- in com.sifa.poliklinik.service.InsuranceMockServiceTest</w:t>
+        <w:t>[INFO] Tests run: 8, Failures: 0, Errors: 0, Skipped: 0, Time elapsed: 0.012 s -- in com.sifa.poliklinik.service.InsuranceMockServiceTest</w:t>
         <w:br/>
         <w:br/>
         <w:t>[INFO] Results:</w:t>
         <w:br/>
         <w:br/>
-        <w:t>[INFO] Tests run: 21, Failures: 0, Errors: 0, Skipped: 0</w:t>
+        <w:t>[INFO] Tests run: 26, Failures: 0, Errors: 0, Skipped: 0</w:t>
         <w:br/>
         <w:br/>
         <w:t>[INFO] ------------------------------------------------------------------------</w:t>

</xml_diff>